<commit_message>
fix(sync): stabilize 3.47.5 retry validation
</commit_message>
<xml_diff>
--- a/jackyun-portal/docs/offline-task-503-retry-3.47.5.docx
+++ b/jackyun-portal/docs/offline-task-503-retry-3.47.5.docx
@@ -1207,6 +1207,34 @@
         <w:t>当前状态：客户端修复、217 项同步测试、生产构建和本地快速任务浏览器回归已有通过证据；完整 UI CI 历史运行不全绿；Azure 生产仍为旧版且 v5 路由 404；数据库认证、schema 与迁移未验证。DOCX 标准渲染器缺少 LibreOffice，本机 Word COM 也无法在当前非交互会话启动，因此视觉检查未完成。以上限制意味着生产 v5 灰度仍应关闭。</w:t>
       </w:r>
     </w:p>
+    <w:p>
+      <w:pPr>
+        <w:pStyle w:val="Heading1"/>
+      </w:pPr>
+      <w:r>
+        <w:t>本轮补充验证</w:t>
+      </w:r>
+    </w:p>
+    <w:p>
+      <w:r>
+        <w:t>截至 2026 年 10 月 26 日，PR #158 的 GitHub Actions run 40259371129 已完成分析。失败发生在 Existing data safety regressions，而非 503 同步逻辑：更新历史测试发现 3.47.4 与 3.47.5 同时标记为精选版本，且客户端诊断常量 APP_VERSION 仍为 3.47.4。已将 APP_VERSION 更新为 3.47.5，并移除旧版本的精选标记；package.json、package-lock.json、更新历史和客户端诊断现已一致。</w:t>
+      </w:r>
+    </w:p>
+    <w:p>
+      <w:r>
+        <w:t>修复后的本地验证结果：更新历史一致性测试 3/3 通过；GitHub 同一步骤所运行的完整 Node 数据安全回归 910/910 通过；Next.js 生产构建及 TypeScript 检查通过；使用生产模式站点、认证测试夹具和 Microsoft Edge 执行 quick-task-ui 浏览器验收，4/4 检查通过，覆盖手机输入触控尺寸、任务日期与时长、503 后本地 outbox 保留且不暴露原始错误、后台重试复用 operationId 并按回执清理队列。</w:t>
+      </w:r>
+    </w:p>
+    <w:p>
+      <w:r>
+        <w:t>浏览器用例在确认本地队列持久化后触发应用已有的 jackyun-sync-retry 事件，避免初始化同步租约造成用例不确定地停留在本地队列；产品同步实现没有因此更改。GitHub Actions 的完整 UI flow 尚待修复提交后重新运行，故本机通过不等同于远端 CI 通过。</w:t>
+      </w:r>
+    </w:p>
+    <w:p>
+      <w:r>
+        <w:t>本补充不改变 Azure 状态：线上 Functions 仍需核对版本及 v5 路由，数据库认证、迁移/恢复演练、专用测试账号读写和手机—电脑验收均未完成；v5 继续保持默认关闭。本文件未能使用 LibreOffice 或非交互 Word 完成标准分页渲染，视觉 QA 仍未验证。</w:t>
+      </w:r>
+    </w:p>
     <w:sectPr>
       <w:footerReference w:type="default" r:id="rId9"/>
       <w:pgSz w:w="12240" w:h="15840"/>

</xml_diff>

<commit_message>
test(sync): tolerate scheduled lane contention
</commit_message>
<xml_diff>
--- a/jackyun-portal/docs/offline-task-503-retry-3.47.5.docx
+++ b/jackyun-portal/docs/offline-task-503-retry-3.47.5.docx
@@ -1235,6 +1235,16 @@
         <w:t>本补充不改变 Azure 状态：线上 Functions 仍需核对版本及 v5 路由，数据库认证、迁移/恢复演练、专用测试账号读写和手机—电脑验收均未完成；v5 继续保持默认关闭。本文件未能使用 LibreOffice 或非交互 Word 完成标准分页渲染，视觉 QA 仍未验证。</w:t>
       </w:r>
     </w:p>
+    <w:p>
+      <w:r>
+        <w:t>修复提交后的 GitHub run 40261027418 已通过 build、Type/lint 和 910 项数据安全回归；生产 UI flows 仍失败，其中 quick-task 在 Linux Chromium 中也暴露了初始化租约竞态。浏览器用例现已改为在本地队列确认后短暂触发已有同步重试事件，直到首个 POST 发出便停止；该版本在本机生产模式 Edge 夹具中再次通过 4/4 检查。下一提交后的远端 UI flow 仍需复验。</w:t>
+      </w:r>
+    </w:p>
+    <w:p>
+      <w:r>
+        <w:t>同一远端 UI run 还报告 ui-shell、quiz、IELTS dashboard、active legacy、study guide、music player、answer sheet、CUE route/search 和 review queue 等其他既有浏览器断言失败；这些不属于本次同步改动范围，PR 暂不合并，需以之后的远端结果区分基线与新增回归。</w:t>
+      </w:r>
+    </w:p>
     <w:sectPr>
       <w:footerReference w:type="default" r:id="rId9"/>
       <w:pgSz w:w="12240" w:h="15840"/>

</xml_diff>

<commit_message>
test(sync): await durable retry receipt state
</commit_message>
<xml_diff>
--- a/jackyun-portal/docs/offline-task-503-retry-3.47.5.docx
+++ b/jackyun-portal/docs/offline-task-503-retry-3.47.5.docx
@@ -1245,6 +1245,16 @@
         <w:t>同一远端 UI run 还报告 ui-shell、quiz、IELTS dashboard、active legacy、study guide、music player、answer sheet、CUE route/search 和 review queue 等其他既有浏览器断言失败；这些不属于本次同步改动范围，PR 暂不合并，需以之后的远端结果区分基线与新增回归。</w:t>
       </w:r>
     </w:p>
+    <w:p>
+      <w:r>
+        <w:t>PR review 补充检查指出 HTTP 响应到达与 IndexedDB 后续事务完成之间存在异步间隔。浏览器回归现在会等到 503 的 attemptCount 持久化后再检查重试元数据，并等匹配回执对应的 outbox 删除事务完成后再断言清队列，避免依赖响应事件的偶然时序。</w:t>
+      </w:r>
+    </w:p>
+    <w:p>
+      <w:r>
+        <w:t>PR #158 的 GitHub run 40262305280 已验证租约竞态修复后 quick-task-ui 通过；同一 run 中 build、Type/lint 和 910 项数据安全回归通过，但完整生产 UI flows 因多项与本次同步改动无关的既有页面断言仍失败。该轮在 review 时序补丁推送前完成，故最终提交仍需再跑远端验证。</w:t>
+      </w:r>
+    </w:p>
     <w:sectPr>
       <w:footerReference w:type="default" r:id="rId9"/>
       <w:pgSz w:w="12240" w:h="15840"/>

</xml_diff>

<commit_message>
docs(sync): record final CI acceptance
</commit_message>
<xml_diff>
--- a/jackyun-portal/docs/offline-task-503-retry-3.47.5.docx
+++ b/jackyun-portal/docs/offline-task-503-retry-3.47.5.docx
@@ -1255,6 +1255,11 @@
         <w:t>PR #158 的 GitHub run 40262305280 已验证租约竞态修复后 quick-task-ui 通过；同一 run 中 build、Type/lint 和 910 项数据安全回归通过，但完整生产 UI flows 因多项与本次同步改动无关的既有页面断言仍失败。该轮在 review 时序补丁推送前完成，故最终提交仍需再跑远端验证。</w:t>
       </w:r>
     </w:p>
+    <w:p>
+      <w:r>
+        <w:t>最终 review 时序修复提交 1222677 的 GitHub run 40264020743 通过 build、Type/lint 和 910 项数据安全回归，quick-task-ui 也在 Linux Chromium 中通过。完整 UI flows 仍因非同步页面断言失败而标红；与已合并 PR #157 的 run 40248788309 对比，本次修复了 quick-task-ui 基线失败，ui-shell 也通过，其余失败仍集中在 quiz、IELTS dashboard、旧版学习页、音乐、答题卡、CUE 路由/搜索与 review queue。因此该 PR 的同步专项与数据安全门禁通过，UI 总工作流尚非全绿；PR 合并及其后部署状态需另行记录。</w:t>
+      </w:r>
+    </w:p>
     <w:sectPr>
       <w:footerReference w:type="default" r:id="rId9"/>
       <w:pgSz w:w="12240" w:h="15840"/>

</xml_diff>